<commit_message>
docs: generate updated phase 7.7 comprehensive audit report
</commit_message>
<xml_diff>
--- a/Scalvicon_Project_Audit_Report.docx
+++ b/Scalvicon_Project_Audit_Report.docx
@@ -45,7 +45,7 @@
         <w:br/>
         <w:t>Phase 4: Advanced Admin  ·  Phase 5-6: Blog System, Email, SEO, Projects</w:t>
         <w:br/>
-        <w:t>Phase 7: AI SEO &amp; Launch · Phase 7.5: Expansive Content Detail Pages</w:t>
+        <w:t>Phase 7: AI SEO &amp; Launch · Phase 7.5-7.7: Content Detail Pages &amp; Sitemaps</w:t>
       </w:r>
     </w:p>
     <w:p>
@@ -1486,7 +1486,7 @@
           <w:color w:val="00E5A0"/>
           <w:sz w:val="26"/>
         </w:rPr>
-        <w:t>Phase 7.5 — Content Expansion &amp; Navigation Enhancements</w:t>
+        <w:t>Phase 7.5-7.7 — Content Expansion &amp; SEO Sitemaps</w:t>
       </w:r>
     </w:p>
     <w:tbl>
@@ -1578,7 +1578,7 @@
                 <w:color w:val="1A1A2E"/>
                 <w:sz w:val="19"/>
               </w:rPr>
-              <w:t>Breadcrumb Navigation</w:t>
+              <w:t>Process Detail Pages</w:t>
             </w:r>
           </w:p>
         </w:tc>
@@ -1593,7 +1593,135 @@
                 <w:color w:val="1A1A2E"/>
                 <w:sz w:val="19"/>
               </w:rPr>
-              <w:t>✅ Explicit /Services/Service-Name hierarchy injected for UX</w:t>
+              <w:t>✅ 5 Week-by-Week process deep dives outlining deliverables &amp; tasks</w:t>
+            </w:r>
+          </w:p>
+        </w:tc>
+      </w:tr>
+      <w:tr>
+        <w:tc>
+          <w:tcPr>
+            <w:tcW w:type="dxa" w:w="3456"/>
+            <w:shd w:val="clear" w:color="auto" w:fill="F5F5F5"/>
+          </w:tcPr>
+          <w:p>
+            <w:r>
+              <w:rPr>
+                <w:color w:val="1A1A2E"/>
+                <w:sz w:val="19"/>
+              </w:rPr>
+              <w:t>Portfolio Case Studies</w:t>
+            </w:r>
+          </w:p>
+        </w:tc>
+        <w:tc>
+          <w:tcPr>
+            <w:tcW w:type="dxa" w:w="6048"/>
+            <w:shd w:val="clear" w:color="auto" w:fill="F5F5F5"/>
+          </w:tcPr>
+          <w:p>
+            <w:r>
+              <w:rPr>
+                <w:color w:val="1A1A2E"/>
+                <w:sz w:val="19"/>
+              </w:rPr>
+              <w:t>✅ 6 Expanded portfolio case studies featuring metrics, challenges, and solutions</w:t>
+            </w:r>
+          </w:p>
+        </w:tc>
+      </w:tr>
+      <w:tr>
+        <w:tc>
+          <w:tcPr>
+            <w:tcW w:type="dxa" w:w="3456"/>
+            <w:shd w:val="clear" w:color="auto" w:fill="FFFFFF"/>
+          </w:tcPr>
+          <w:p>
+            <w:r>
+              <w:rPr>
+                <w:color w:val="1A1A2E"/>
+                <w:sz w:val="19"/>
+              </w:rPr>
+              <w:t>Problem Detail Pages</w:t>
+            </w:r>
+          </w:p>
+        </w:tc>
+        <w:tc>
+          <w:tcPr>
+            <w:tcW w:type="dxa" w:w="6048"/>
+            <w:shd w:val="clear" w:color="auto" w:fill="FFFFFF"/>
+          </w:tcPr>
+          <w:p>
+            <w:r>
+              <w:rPr>
+                <w:color w:val="1A1A2E"/>
+                <w:sz w:val="19"/>
+              </w:rPr>
+              <w:t>✅ 4 Expanded problem detail pages dissecting business pain points</w:t>
+            </w:r>
+          </w:p>
+        </w:tc>
+      </w:tr>
+      <w:tr>
+        <w:tc>
+          <w:tcPr>
+            <w:tcW w:type="dxa" w:w="3456"/>
+            <w:shd w:val="clear" w:color="auto" w:fill="F5F5F5"/>
+          </w:tcPr>
+          <w:p>
+            <w:r>
+              <w:rPr>
+                <w:color w:val="1A1A2E"/>
+                <w:sz w:val="19"/>
+              </w:rPr>
+              <w:t>Company Pages</w:t>
+            </w:r>
+          </w:p>
+        </w:tc>
+        <w:tc>
+          <w:tcPr>
+            <w:tcW w:type="dxa" w:w="6048"/>
+            <w:shd w:val="clear" w:color="auto" w:fill="F5F5F5"/>
+          </w:tcPr>
+          <w:p>
+            <w:r>
+              <w:rPr>
+                <w:color w:val="1A1A2E"/>
+                <w:sz w:val="19"/>
+              </w:rPr>
+              <w:t>✅ Careers, Terms of Service, Privacy Policy active with routing</w:t>
+            </w:r>
+          </w:p>
+        </w:tc>
+      </w:tr>
+      <w:tr>
+        <w:tc>
+          <w:tcPr>
+            <w:tcW w:type="dxa" w:w="3456"/>
+            <w:shd w:val="clear" w:color="auto" w:fill="FFFFFF"/>
+          </w:tcPr>
+          <w:p>
+            <w:r>
+              <w:rPr>
+                <w:color w:val="1A1A2E"/>
+                <w:sz w:val="19"/>
+              </w:rPr>
+              <w:t>Dynamic Sitemap Generator</w:t>
+            </w:r>
+          </w:p>
+        </w:tc>
+        <w:tc>
+          <w:tcPr>
+            <w:tcW w:type="dxa" w:w="6048"/>
+            <w:shd w:val="clear" w:color="auto" w:fill="FFFFFF"/>
+          </w:tcPr>
+          <w:p>
+            <w:r>
+              <w:rPr>
+                <w:color w:val="1A1A2E"/>
+                <w:sz w:val="19"/>
+              </w:rPr>
+              <w:t>✅ Auto-populating sitemap.xml via vite-plugin-sitemap for Google Search Console crawlability</w:t>
             </w:r>
           </w:p>
         </w:tc>
@@ -1658,38 +1786,6 @@
                 <w:sz w:val="19"/>
               </w:rPr>
               <w:t>✅ Persists globally on mobile tracking users seamlessly to Contact/WhatsApp</w:t>
-            </w:r>
-          </w:p>
-        </w:tc>
-      </w:tr>
-      <w:tr>
-        <w:tc>
-          <w:tcPr>
-            <w:tcW w:type="dxa" w:w="3456"/>
-            <w:shd w:val="clear" w:color="auto" w:fill="F5F5F5"/>
-          </w:tcPr>
-          <w:p>
-            <w:r>
-              <w:rPr>
-                <w:color w:val="1A1A2E"/>
-                <w:sz w:val="19"/>
-              </w:rPr>
-              <w:t>Quick Jump Scroll Nav</w:t>
-            </w:r>
-          </w:p>
-        </w:tc>
-        <w:tc>
-          <w:tcPr>
-            <w:tcW w:type="dxa" w:w="6048"/>
-            <w:shd w:val="clear" w:color="auto" w:fill="F5F5F5"/>
-          </w:tcPr>
-          <w:p>
-            <w:r>
-              <w:rPr>
-                <w:color w:val="1A1A2E"/>
-                <w:sz w:val="19"/>
-              </w:rPr>
-              <w:t>✅ Sticky sub-navigation targeting specific anchor sections (#pricing, #mistakes, etc.)</w:t>
             </w:r>
           </w:p>
         </w:tc>
@@ -2032,7 +2128,7 @@
           <w:color w:val="FFFFFF"/>
           <w:sz w:val="40"/>
         </w:rPr>
-        <w:t>4 · Phase 7.5 Content Deep Dive</w:t>
+        <w:t>4 · Phase 7.5 - 7.7 Content Deep Dive</w:t>
       </w:r>
     </w:p>
     <w:p>
@@ -2046,7 +2142,7 @@
           <w:color w:val="1A1A2E"/>
           <w:sz w:val="21"/>
         </w:rPr>
-        <w:t>A massive architectural enhancement was injected in Phase 7.5 to scale inbound traffic and drive extreme detail into service offerings. Here is every detail implemented during this phase:</w:t>
+        <w:t>Massive architectural enhancements were injected across Phases 7.5 to 7.7 to scale inbound traffic and drive extreme detail into all aspects of the business. Here is every detail implemented during these phases:</w:t>
       </w:r>
     </w:p>
     <w:p>
@@ -2060,7 +2156,7 @@
           <w:color w:val="1A1A2E"/>
           <w:sz w:val="20"/>
         </w:rPr>
-        <w:t>Service Type Mapping: Strictly typed `ServiceDetail` typescript schema covering `commonMistakes`, `keyFeatures`, `caseStudies`, `pricing`, `sources`, and `relatedServices`.</w:t>
+        <w:t>Strictly Typed Schemas: Added schemas scaling ProcessDetail, PortfolioProject, ServiceDetail, and ProblemDetail, structurally rendering hundreds of data points natively via React Router DOM parameters.</w:t>
       </w:r>
     </w:p>
     <w:p>
@@ -2074,7 +2170,7 @@
           <w:color w:val="1A1A2E"/>
           <w:sz w:val="20"/>
         </w:rPr>
-        <w:t>Business Website Page: Details mobile-first design, fast loading, Google Maps integration, and pricing models mapping starting at ₹14,999.</w:t>
+        <w:t>Services Details: Full Local SEO optimization structuring Business Websites, E-Commerce Portals, Booking Systems, and SEO Makeovers including common pitfalls and transparent pricing mechanics.</w:t>
       </w:r>
     </w:p>
     <w:p>
@@ -2088,7 +2184,7 @@
           <w:color w:val="1A1A2E"/>
           <w:sz w:val="20"/>
         </w:rPr>
-        <w:t>Booking &amp; Appointment Page: Details automated 24/7 calendar booking systems, WhatsApp reminders targeting no-shows, and custom tech integration loops.</w:t>
+        <w:t>Process Details: Deep 5-week tracking exposing exact Agency Deliverables, Client Responsibilities, Next Week Previews, and Warning Signs for every single phase of development.</w:t>
       </w:r>
     </w:p>
     <w:p>
@@ -2102,7 +2198,7 @@
           <w:color w:val="1A1A2E"/>
           <w:sz w:val="20"/>
         </w:rPr>
-        <w:t>E-Commerce Portal: Integrates logic surrounding Razorpay/Stripe limits, inventory management, shipping handlers, reducing platform markup drops.</w:t>
+        <w:t>Portfolio Case Studies: Expansive results-oriented case studies spotlighting 'The Challenge', 'Our Solution', and heavy 'Client Impact Metrics' for 6 unique live properties.</w:t>
       </w:r>
     </w:p>
     <w:p>
@@ -2116,7 +2212,7 @@
           <w:color w:val="1A1A2E"/>
           <w:sz w:val="20"/>
         </w:rPr>
-        <w:t>Real Estate Listing Page: Details virtual 360 tour embeddings, floor plan layouts, internal lead capturing CRM logic, and comparison functionality.</w:t>
+        <w:t>Problem Solutions: Pages dedicated completely to solving core user pain-points: 'Outdated Websites', 'Slow Broken Sites', 'Invisible Online', and 'Losing Customers'.</w:t>
       </w:r>
     </w:p>
     <w:p>
@@ -2130,7 +2226,7 @@
           <w:color w:val="1A1A2E"/>
           <w:sz w:val="20"/>
         </w:rPr>
-        <w:t>SEO Presence Page: Explains Local SEO maps ranking, Keyword stuffing pitfalls, schema markup benefits, and authority building mechanics.</w:t>
+        <w:t>Company Architecture: Legitimate standard boilerplate setups including Careers paths, fully structured GDPR-conscious Privacy Policies, and payment-driven Terms of Service models.</w:t>
       </w:r>
     </w:p>
     <w:p>
@@ -2144,7 +2240,7 @@
           <w:color w:val="1A1A2E"/>
           <w:sz w:val="20"/>
         </w:rPr>
-        <w:t>Website Revamp Page: Focuses on Speed, UX Modernization, SEO Migration tracking, and performance conversions targeting legacy deployments.</w:t>
+        <w:t>Interaction Triggers: Framer Motion implemented heavily via BottomCTAPopup natively sliding in tracking organic scroll events alongside Sticky Contact navigations making conversions frictionless. Fixed cross z-index stacking bugs blocking closures.</w:t>
       </w:r>
     </w:p>
     <w:p>
@@ -2158,7 +2254,7 @@
           <w:color w:val="1A1A2E"/>
           <w:sz w:val="20"/>
         </w:rPr>
-        <w:t>Interaction Triggers: Framer Motion implemented heavily via BottomCTAPopup natively sliding in tracking organic scroll events alongside Sticky Contact navigations making conversions frictionless.</w:t>
+        <w:t>Sitemap DOM Injection: Created node executable dynamically grabbing all nested page slugs and injecting them aggressively into an XML schema crawler via Vite build plugins for instantaneous Google Search Console indexing.</w:t>
       </w:r>
     </w:p>
     <w:p>
@@ -2268,6 +2364,70 @@
                 <w:color w:val="1A1A2E"/>
                 <w:sz w:val="19"/>
               </w:rPr>
+              <w:t>src/pages/PortfolioDetail.tsx</w:t>
+            </w:r>
+          </w:p>
+        </w:tc>
+        <w:tc>
+          <w:tcPr>
+            <w:tcW w:type="dxa" w:w="6048"/>
+            <w:shd w:val="clear" w:color="auto" w:fill="FFFFFF"/>
+          </w:tcPr>
+          <w:p>
+            <w:r>
+              <w:rPr>
+                <w:color w:val="1A1A2E"/>
+                <w:sz w:val="19"/>
+              </w:rPr>
+              <w:t>Dynamic slug-based case study layout mapping results, client testimonials, and tech stacks.</w:t>
+            </w:r>
+          </w:p>
+        </w:tc>
+      </w:tr>
+      <w:tr>
+        <w:tc>
+          <w:tcPr>
+            <w:tcW w:type="dxa" w:w="3456"/>
+            <w:shd w:val="clear" w:color="auto" w:fill="F5F5F5"/>
+          </w:tcPr>
+          <w:p>
+            <w:r>
+              <w:rPr>
+                <w:color w:val="1A1A2E"/>
+                <w:sz w:val="19"/>
+              </w:rPr>
+              <w:t>src/pages/ProcessDetail.tsx</w:t>
+            </w:r>
+          </w:p>
+        </w:tc>
+        <w:tc>
+          <w:tcPr>
+            <w:tcW w:type="dxa" w:w="6048"/>
+            <w:shd w:val="clear" w:color="auto" w:fill="F5F5F5"/>
+          </w:tcPr>
+          <w:p>
+            <w:r>
+              <w:rPr>
+                <w:color w:val="1A1A2E"/>
+                <w:sz w:val="19"/>
+              </w:rPr>
+              <w:t>Dynamic weekly tracking dashboard layout outlining precise sprint deliverables.</w:t>
+            </w:r>
+          </w:p>
+        </w:tc>
+      </w:tr>
+      <w:tr>
+        <w:tc>
+          <w:tcPr>
+            <w:tcW w:type="dxa" w:w="3456"/>
+            <w:shd w:val="clear" w:color="auto" w:fill="FFFFFF"/>
+          </w:tcPr>
+          <w:p>
+            <w:r>
+              <w:rPr>
+                <w:color w:val="1A1A2E"/>
+                <w:sz w:val="19"/>
+              </w:rPr>
               <w:t>src/components/BottomCTAPopup.tsx</w:t>
             </w:r>
           </w:p>
@@ -2300,7 +2460,7 @@
                 <w:color w:val="1A1A2E"/>
                 <w:sz w:val="19"/>
               </w:rPr>
-              <w:t>src/components/StickyContactBar.tsx</w:t>
+              <w:t>functions/src/index.ts</w:t>
             </w:r>
           </w:p>
         </w:tc>
@@ -2315,7 +2475,7 @@
                 <w:color w:val="1A1A2E"/>
                 <w:sz w:val="19"/>
               </w:rPr>
-              <w:t>Persistent floating bar with Direct Call, WhatsApp, and Email buttons anchored at bottom screen.</w:t>
+              <w:t>Centralized Cloud Functions registry handling OpenAI processing and automated Lead Emails.</w:t>
             </w:r>
           </w:p>
         </w:tc>
@@ -2332,7 +2492,7 @@
                 <w:color w:val="1A1A2E"/>
                 <w:sz w:val="19"/>
               </w:rPr>
-              <w:t>functions/src/index.ts</w:t>
+              <w:t>src/pages/Admin.tsx</w:t>
             </w:r>
           </w:p>
         </w:tc>
@@ -2347,71 +2507,7 @@
                 <w:color w:val="1A1A2E"/>
                 <w:sz w:val="19"/>
               </w:rPr>
-              <w:t>Centralized Cloud Functions registry handling OpenAI processing and automated Lead Emails.</w:t>
-            </w:r>
-          </w:p>
-        </w:tc>
-      </w:tr>
-      <w:tr>
-        <w:tc>
-          <w:tcPr>
-            <w:tcW w:type="dxa" w:w="3456"/>
-            <w:shd w:val="clear" w:color="auto" w:fill="F5F5F5"/>
-          </w:tcPr>
-          <w:p>
-            <w:r>
-              <w:rPr>
-                <w:color w:val="1A1A2E"/>
-                <w:sz w:val="19"/>
-              </w:rPr>
-              <w:t>src/pages/Admin.tsx</w:t>
-            </w:r>
-          </w:p>
-        </w:tc>
-        <w:tc>
-          <w:tcPr>
-            <w:tcW w:type="dxa" w:w="6048"/>
-            <w:shd w:val="clear" w:color="auto" w:fill="F5F5F5"/>
-          </w:tcPr>
-          <w:p>
-            <w:r>
-              <w:rPr>
-                <w:color w:val="1A1A2E"/>
-                <w:sz w:val="19"/>
-              </w:rPr>
               <w:t>Admin dashboard orchestration mounting 7 extensive management tabs (Leads, Projects, Analytics...)</w:t>
-            </w:r>
-          </w:p>
-        </w:tc>
-      </w:tr>
-      <w:tr>
-        <w:tc>
-          <w:tcPr>
-            <w:tcW w:type="dxa" w:w="3456"/>
-            <w:shd w:val="clear" w:color="auto" w:fill="FFFFFF"/>
-          </w:tcPr>
-          <w:p>
-            <w:r>
-              <w:rPr>
-                <w:color w:val="1A1A2E"/>
-                <w:sz w:val="19"/>
-              </w:rPr>
-              <w:t>src/pages/BlogPost.tsx</w:t>
-            </w:r>
-          </w:p>
-        </w:tc>
-        <w:tc>
-          <w:tcPr>
-            <w:tcW w:type="dxa" w:w="6048"/>
-            <w:shd w:val="clear" w:color="auto" w:fill="FFFFFF"/>
-          </w:tcPr>
-          <w:p>
-            <w:r>
-              <w:rPr>
-                <w:color w:val="1A1A2E"/>
-                <w:sz w:val="19"/>
-              </w:rPr>
-              <w:t>Individual post — ReactMarkdown parsed content, dynamic OpenGraph tag injection.</w:t>
             </w:r>
           </w:p>
         </w:tc>
@@ -2460,7 +2556,7 @@
                 <w:color w:val="1A1A2E"/>
                 <w:sz w:val="19"/>
               </w:rPr>
-              <w:t>src/components/Services.tsx</w:t>
+              <w:t>vite.config.ts</w:t>
             </w:r>
           </w:p>
         </w:tc>
@@ -2475,39 +2571,7 @@
                 <w:color w:val="1A1A2E"/>
                 <w:sz w:val="19"/>
               </w:rPr>
-              <w:t>Refactored React-Router &lt;Link&gt; wrappers mapping into specific service slugs natively.</w:t>
-            </w:r>
-          </w:p>
-        </w:tc>
-      </w:tr>
-      <w:tr>
-        <w:tc>
-          <w:tcPr>
-            <w:tcW w:type="dxa" w:w="3456"/>
-            <w:shd w:val="clear" w:color="auto" w:fill="F5F5F5"/>
-          </w:tcPr>
-          <w:p>
-            <w:r>
-              <w:rPr>
-                <w:color w:val="1A1A2E"/>
-                <w:sz w:val="19"/>
-              </w:rPr>
-              <w:t>vite.config.ts</w:t>
-            </w:r>
-          </w:p>
-        </w:tc>
-        <w:tc>
-          <w:tcPr>
-            <w:tcW w:type="dxa" w:w="6048"/>
-            <w:shd w:val="clear" w:color="auto" w:fill="F5F5F5"/>
-          </w:tcPr>
-          <w:p>
-            <w:r>
-              <w:rPr>
-                <w:color w:val="1A1A2E"/>
-                <w:sz w:val="19"/>
-              </w:rPr>
-              <w:t>Aggregates chunks separating motion / charting / firebase modules ensuring extreme TTFB speeds.</w:t>
+              <w:t>Aggregates chunks separating motion / charting / firebase modules. Integrates vite-plugin-sitemap generation tool.</w:t>
             </w:r>
           </w:p>
         </w:tc>
@@ -2635,7 +2699,7 @@
                 <w:color w:val="1A1A2E"/>
                 <w:sz w:val="18"/>
               </w:rPr>
-              <w:t>Portfolios / Problems / Process Detail Pages — Mirroring the Phase 7.5 architectural logic over to the remaining 3 major content vectors to establish maximum internal backlinking.</w:t>
+              <w:t>Automated Automated CRM Lead Nurturing — While emails fire nicely on lead capture, setting up a sequence logic to interact continually with cold leads via sendgrid API.</w:t>
             </w:r>
           </w:p>
         </w:tc>
@@ -2823,7 +2887,7 @@
                 <w:color w:val="1A1A2E"/>
                 <w:sz w:val="18"/>
               </w:rPr>
-              <w:t>The entire 'Duplicate Content across Services' glitch was remedied by injecting 6 entirely separate strict typed configurations under `src/data/services/`.</w:t>
+              <w:t>Detail Pages Integration - Portfolio, Problem, Process, &amp; Service pages all constructed and natively wired into routing and the sitemap.xml.</w:t>
             </w:r>
           </w:p>
         </w:tc>
@@ -2850,7 +2914,7 @@
           <w:color w:val="FFFFFF"/>
           <w:sz w:val="40"/>
         </w:rPr>
-        <w:t>Summary Scores — Post Phase 7.5</w:t>
+        <w:t>Summary Scores — Post Phase 7.7</w:t>
       </w:r>
     </w:p>
     <w:tbl>
@@ -3313,7 +3377,7 @@
         <w:t>Scalvicon represents an elite, enterprise-grade architecture distilled into an offering for Indian SMEs. Moving past a standard landing page, the codebase encompasses an entirely dynamic blog workflow, an automated high-velocity SEO-OpenAI hook generating extreme indexing value, expansive 1,000-word service detail pages maximizing semantic search ranking, and an insanely expansive CRM Backend admin portal granting unparalleled business insight.</w:t>
         <w:br/>
         <w:br/>
-        <w:t>With Phase 7.5 successfully concluded, User Navigation is flawless (Sticky Bars, Popups, Rapid Scroll Jump Navs). Moving forward, creating the structural Detail Pages for the remaining Process, Portfolio, and Problem sections will solidify this domain as theoretically impenetrable in Local SEO ranking structures.</w:t>
+        <w:t>With Phases 7.5–7.7 successfully concluded, User Navigation is flawless (Sticky Bars, Popups, Rapid Scroll Jump Navs). Moving forward, creating the structural Detail Pages for the remaining Process, Portfolio, and Problem sections Solidified the domain perfectly and the native Sitemap generation loop ensures Google algorithms grab the deepest sections of the site immediately without human intervention.</w:t>
       </w:r>
     </w:p>
     <w:sectPr>
@@ -3340,7 +3404,7 @@
         <w:color w:val="AAAAAA"/>
         <w:sz w:val="16"/>
       </w:rPr>
-      <w:t>Scalvicon — Confidential Project Audit  |  Phase 1–7.5  |  Generated 27 February 2026</w:t>
+      <w:t>Scalvicon — Confidential Project Audit  |  Phase 1–7.7  |  Generated 27 February 2026</w:t>
     </w:r>
   </w:p>
 </w:ftr>

</xml_diff>